<commit_message>
PDF→Word 첫 컬럼 chunk 누락 수정 (왼쪽 경계 -Infinity)
</commit_message>
<xml_diff>
--- a/test/out_full/out_cross.docx
+++ b/test/out_full/out_cross.docx
@@ -33,22 +33,22 @@
         </w:tblBorders>
       </w:tblPr>
       <w:tblGrid>
-        <w:gridCol w:w="800"/>
-        <w:gridCol w:w="800"/>
-        <w:gridCol w:w="935"/>
-        <w:gridCol w:w="1037"/>
-        <w:gridCol w:w="1344"/>
-        <w:gridCol w:w="1083"/>
-        <w:gridCol w:w="1366"/>
-        <w:gridCol w:w="1287"/>
-        <w:gridCol w:w="1100"/>
-        <w:gridCol w:w="924"/>
-        <w:gridCol w:w="800"/>
+        <w:gridCol w:w="700"/>
+        <w:gridCol w:w="700"/>
+        <w:gridCol w:w="729"/>
+        <w:gridCol w:w="809"/>
+        <w:gridCol w:w="1048"/>
+        <w:gridCol w:w="844"/>
+        <w:gridCol w:w="1065"/>
+        <w:gridCol w:w="1003"/>
+        <w:gridCol w:w="857"/>
+        <w:gridCol w:w="721"/>
+        <w:gridCol w:w="910"/>
       </w:tblGrid>
       <w:tr>
         <w:tc>
           <w:tcPr>
-            <w:tcW w:type="dxa" w:w="800"/>
+            <w:tcW w:type="dxa" w:w="700"/>
             <w:shd w:fill="DEDEDE" w:color="auto" w:val="clear"/>
           </w:tcPr>
           <w:p>
@@ -64,7 +64,7 @@
         </w:tc>
         <w:tc>
           <w:tcPr>
-            <w:tcW w:type="dxa" w:w="800"/>
+            <w:tcW w:type="dxa" w:w="700"/>
             <w:shd w:fill="DEDEDE" w:color="auto" w:val="clear"/>
           </w:tcPr>
           <w:p>
@@ -80,7 +80,7 @@
         </w:tc>
         <w:tc>
           <w:tcPr>
-            <w:tcW w:type="dxa" w:w="935"/>
+            <w:tcW w:type="dxa" w:w="729"/>
             <w:shd w:fill="DEDEDE" w:color="auto" w:val="clear"/>
           </w:tcPr>
           <w:p>
@@ -96,7 +96,7 @@
         </w:tc>
         <w:tc>
           <w:tcPr>
-            <w:tcW w:type="dxa" w:w="1037"/>
+            <w:tcW w:type="dxa" w:w="809"/>
             <w:shd w:fill="DEDEDE" w:color="auto" w:val="clear"/>
           </w:tcPr>
           <w:p>
@@ -112,7 +112,7 @@
         </w:tc>
         <w:tc>
           <w:tcPr>
-            <w:tcW w:type="dxa" w:w="1344"/>
+            <w:tcW w:type="dxa" w:w="1048"/>
             <w:shd w:fill="DEDEDE" w:color="auto" w:val="clear"/>
           </w:tcPr>
           <w:p>
@@ -128,7 +128,7 @@
         </w:tc>
         <w:tc>
           <w:tcPr>
-            <w:tcW w:type="dxa" w:w="1083"/>
+            <w:tcW w:type="dxa" w:w="844"/>
             <w:shd w:fill="DEDEDE" w:color="auto" w:val="clear"/>
           </w:tcPr>
           <w:p>
@@ -144,7 +144,7 @@
         </w:tc>
         <w:tc>
           <w:tcPr>
-            <w:tcW w:type="dxa" w:w="1366"/>
+            <w:tcW w:type="dxa" w:w="1065"/>
             <w:shd w:fill="DEDEDE" w:color="auto" w:val="clear"/>
           </w:tcPr>
           <w:p>
@@ -160,7 +160,7 @@
         </w:tc>
         <w:tc>
           <w:tcPr>
-            <w:tcW w:type="dxa" w:w="1287"/>
+            <w:tcW w:type="dxa" w:w="1003"/>
             <w:shd w:fill="DEDEDE" w:color="auto" w:val="clear"/>
           </w:tcPr>
           <w:p>
@@ -176,7 +176,7 @@
         </w:tc>
         <w:tc>
           <w:tcPr>
-            <w:tcW w:type="dxa" w:w="1100"/>
+            <w:tcW w:type="dxa" w:w="857"/>
             <w:shd w:fill="DEDEDE" w:color="auto" w:val="clear"/>
           </w:tcPr>
           <w:p>
@@ -192,7 +192,7 @@
         </w:tc>
         <w:tc>
           <w:tcPr>
-            <w:tcW w:type="dxa" w:w="924"/>
+            <w:tcW w:type="dxa" w:w="721"/>
             <w:shd w:fill="DEDEDE" w:color="auto" w:val="clear"/>
           </w:tcPr>
           <w:p>
@@ -208,7 +208,7 @@
         </w:tc>
         <w:tc>
           <w:tcPr>
-            <w:tcW w:type="dxa" w:w="800"/>
+            <w:tcW w:type="dxa" w:w="910"/>
           </w:tcPr>
           <w:p>
             <w:r>
@@ -225,7 +225,7 @@
       <w:tr>
         <w:tc>
           <w:tcPr>
-            <w:tcW w:type="dxa" w:w="800"/>
+            <w:tcW w:type="dxa" w:w="700"/>
           </w:tcPr>
           <w:p>
             <w:r>
@@ -240,7 +240,7 @@
         </w:tc>
         <w:tc>
           <w:tcPr>
-            <w:tcW w:type="dxa" w:w="800"/>
+            <w:tcW w:type="dxa" w:w="700"/>
           </w:tcPr>
           <w:p>
             <w:r>
@@ -255,7 +255,7 @@
         </w:tc>
         <w:tc>
           <w:tcPr>
-            <w:tcW w:type="dxa" w:w="935"/>
+            <w:tcW w:type="dxa" w:w="729"/>
           </w:tcPr>
           <w:p>
             <w:r>
@@ -270,7 +270,7 @@
         </w:tc>
         <w:tc>
           <w:tcPr>
-            <w:tcW w:type="dxa" w:w="1037"/>
+            <w:tcW w:type="dxa" w:w="809"/>
           </w:tcPr>
           <w:p>
             <w:r>
@@ -285,7 +285,7 @@
         </w:tc>
         <w:tc>
           <w:tcPr>
-            <w:tcW w:type="dxa" w:w="1344"/>
+            <w:tcW w:type="dxa" w:w="1048"/>
           </w:tcPr>
           <w:p>
             <w:r>
@@ -300,7 +300,7 @@
         </w:tc>
         <w:tc>
           <w:tcPr>
-            <w:tcW w:type="dxa" w:w="1083"/>
+            <w:tcW w:type="dxa" w:w="844"/>
           </w:tcPr>
           <w:p>
             <w:r>
@@ -315,7 +315,7 @@
         </w:tc>
         <w:tc>
           <w:tcPr>
-            <w:tcW w:type="dxa" w:w="1366"/>
+            <w:tcW w:type="dxa" w:w="1065"/>
           </w:tcPr>
           <w:p>
             <w:r>
@@ -330,7 +330,7 @@
         </w:tc>
         <w:tc>
           <w:tcPr>
-            <w:tcW w:type="dxa" w:w="1287"/>
+            <w:tcW w:type="dxa" w:w="1003"/>
           </w:tcPr>
           <w:p>
             <w:r>
@@ -345,7 +345,7 @@
         </w:tc>
         <w:tc>
           <w:tcPr>
-            <w:tcW w:type="dxa" w:w="1100"/>
+            <w:tcW w:type="dxa" w:w="857"/>
           </w:tcPr>
           <w:p>
             <w:r>
@@ -360,7 +360,7 @@
         </w:tc>
         <w:tc>
           <w:tcPr>
-            <w:tcW w:type="dxa" w:w="924"/>
+            <w:tcW w:type="dxa" w:w="721"/>
           </w:tcPr>
           <w:p>
             <w:r>
@@ -375,7 +375,7 @@
         </w:tc>
         <w:tc>
           <w:tcPr>
-            <w:tcW w:type="dxa" w:w="800"/>
+            <w:tcW w:type="dxa" w:w="910"/>
           </w:tcPr>
           <w:p>
             <w:r>
@@ -392,7 +392,7 @@
       <w:tr>
         <w:tc>
           <w:tcPr>
-            <w:tcW w:type="dxa" w:w="800"/>
+            <w:tcW w:type="dxa" w:w="700"/>
           </w:tcPr>
           <w:p>
             <w:r>
@@ -407,7 +407,7 @@
         </w:tc>
         <w:tc>
           <w:tcPr>
-            <w:tcW w:type="dxa" w:w="800"/>
+            <w:tcW w:type="dxa" w:w="700"/>
           </w:tcPr>
           <w:p>
             <w:r>
@@ -422,7 +422,7 @@
         </w:tc>
         <w:tc>
           <w:tcPr>
-            <w:tcW w:type="dxa" w:w="935"/>
+            <w:tcW w:type="dxa" w:w="729"/>
           </w:tcPr>
           <w:p>
             <w:r>
@@ -437,7 +437,7 @@
         </w:tc>
         <w:tc>
           <w:tcPr>
-            <w:tcW w:type="dxa" w:w="1037"/>
+            <w:tcW w:type="dxa" w:w="809"/>
           </w:tcPr>
           <w:p>
             <w:r>
@@ -452,7 +452,7 @@
         </w:tc>
         <w:tc>
           <w:tcPr>
-            <w:tcW w:type="dxa" w:w="1344"/>
+            <w:tcW w:type="dxa" w:w="1048"/>
           </w:tcPr>
           <w:p>
             <w:r>
@@ -467,7 +467,7 @@
         </w:tc>
         <w:tc>
           <w:tcPr>
-            <w:tcW w:type="dxa" w:w="1083"/>
+            <w:tcW w:type="dxa" w:w="844"/>
           </w:tcPr>
           <w:p>
             <w:r>
@@ -482,7 +482,7 @@
         </w:tc>
         <w:tc>
           <w:tcPr>
-            <w:tcW w:type="dxa" w:w="1366"/>
+            <w:tcW w:type="dxa" w:w="1065"/>
           </w:tcPr>
           <w:p>
             <w:r>
@@ -497,7 +497,7 @@
         </w:tc>
         <w:tc>
           <w:tcPr>
-            <w:tcW w:type="dxa" w:w="1287"/>
+            <w:tcW w:type="dxa" w:w="1003"/>
           </w:tcPr>
           <w:p>
             <w:r>
@@ -512,7 +512,7 @@
         </w:tc>
         <w:tc>
           <w:tcPr>
-            <w:tcW w:type="dxa" w:w="1100"/>
+            <w:tcW w:type="dxa" w:w="857"/>
           </w:tcPr>
           <w:p>
             <w:r>
@@ -527,7 +527,7 @@
         </w:tc>
         <w:tc>
           <w:tcPr>
-            <w:tcW w:type="dxa" w:w="924"/>
+            <w:tcW w:type="dxa" w:w="721"/>
           </w:tcPr>
           <w:p>
             <w:r>
@@ -542,7 +542,7 @@
         </w:tc>
         <w:tc>
           <w:tcPr>
-            <w:tcW w:type="dxa" w:w="800"/>
+            <w:tcW w:type="dxa" w:w="910"/>
           </w:tcPr>
           <w:p>
             <w:r>
@@ -559,7 +559,7 @@
       <w:tr>
         <w:tc>
           <w:tcPr>
-            <w:tcW w:type="dxa" w:w="800"/>
+            <w:tcW w:type="dxa" w:w="700"/>
           </w:tcPr>
           <w:p>
             <w:r>
@@ -574,7 +574,7 @@
         </w:tc>
         <w:tc>
           <w:tcPr>
-            <w:tcW w:type="dxa" w:w="800"/>
+            <w:tcW w:type="dxa" w:w="700"/>
           </w:tcPr>
           <w:p>
             <w:r>
@@ -589,7 +589,7 @@
         </w:tc>
         <w:tc>
           <w:tcPr>
-            <w:tcW w:type="dxa" w:w="935"/>
+            <w:tcW w:type="dxa" w:w="729"/>
           </w:tcPr>
           <w:p>
             <w:r>
@@ -604,7 +604,7 @@
         </w:tc>
         <w:tc>
           <w:tcPr>
-            <w:tcW w:type="dxa" w:w="1037"/>
+            <w:tcW w:type="dxa" w:w="809"/>
           </w:tcPr>
           <w:p>
             <w:r>
@@ -619,7 +619,7 @@
         </w:tc>
         <w:tc>
           <w:tcPr>
-            <w:tcW w:type="dxa" w:w="1344"/>
+            <w:tcW w:type="dxa" w:w="1048"/>
           </w:tcPr>
           <w:p>
             <w:r>
@@ -634,7 +634,7 @@
         </w:tc>
         <w:tc>
           <w:tcPr>
-            <w:tcW w:type="dxa" w:w="1083"/>
+            <w:tcW w:type="dxa" w:w="844"/>
           </w:tcPr>
           <w:p>
             <w:r>
@@ -649,7 +649,7 @@
         </w:tc>
         <w:tc>
           <w:tcPr>
-            <w:tcW w:type="dxa" w:w="1366"/>
+            <w:tcW w:type="dxa" w:w="1065"/>
           </w:tcPr>
           <w:p>
             <w:r>
@@ -664,7 +664,7 @@
         </w:tc>
         <w:tc>
           <w:tcPr>
-            <w:tcW w:type="dxa" w:w="1287"/>
+            <w:tcW w:type="dxa" w:w="1003"/>
           </w:tcPr>
           <w:p>
             <w:r>
@@ -679,7 +679,7 @@
         </w:tc>
         <w:tc>
           <w:tcPr>
-            <w:tcW w:type="dxa" w:w="1100"/>
+            <w:tcW w:type="dxa" w:w="857"/>
           </w:tcPr>
           <w:p>
             <w:r>
@@ -694,7 +694,7 @@
         </w:tc>
         <w:tc>
           <w:tcPr>
-            <w:tcW w:type="dxa" w:w="924"/>
+            <w:tcW w:type="dxa" w:w="721"/>
           </w:tcPr>
           <w:p>
             <w:r>
@@ -709,7 +709,7 @@
         </w:tc>
         <w:tc>
           <w:tcPr>
-            <w:tcW w:type="dxa" w:w="800"/>
+            <w:tcW w:type="dxa" w:w="910"/>
           </w:tcPr>
           <w:p>
             <w:r>
@@ -726,7 +726,7 @@
       <w:tr>
         <w:tc>
           <w:tcPr>
-            <w:tcW w:type="dxa" w:w="800"/>
+            <w:tcW w:type="dxa" w:w="700"/>
           </w:tcPr>
           <w:p>
             <w:r>
@@ -741,7 +741,7 @@
         </w:tc>
         <w:tc>
           <w:tcPr>
-            <w:tcW w:type="dxa" w:w="800"/>
+            <w:tcW w:type="dxa" w:w="700"/>
           </w:tcPr>
           <w:p>
             <w:r>
@@ -756,7 +756,7 @@
         </w:tc>
         <w:tc>
           <w:tcPr>
-            <w:tcW w:type="dxa" w:w="935"/>
+            <w:tcW w:type="dxa" w:w="729"/>
           </w:tcPr>
           <w:p>
             <w:r>
@@ -771,7 +771,7 @@
         </w:tc>
         <w:tc>
           <w:tcPr>
-            <w:tcW w:type="dxa" w:w="1037"/>
+            <w:tcW w:type="dxa" w:w="809"/>
           </w:tcPr>
           <w:p>
             <w:r>
@@ -786,7 +786,7 @@
         </w:tc>
         <w:tc>
           <w:tcPr>
-            <w:tcW w:type="dxa" w:w="1344"/>
+            <w:tcW w:type="dxa" w:w="1048"/>
           </w:tcPr>
           <w:p>
             <w:r>
@@ -801,7 +801,7 @@
         </w:tc>
         <w:tc>
           <w:tcPr>
-            <w:tcW w:type="dxa" w:w="1083"/>
+            <w:tcW w:type="dxa" w:w="844"/>
           </w:tcPr>
           <w:p>
             <w:r>
@@ -816,7 +816,7 @@
         </w:tc>
         <w:tc>
           <w:tcPr>
-            <w:tcW w:type="dxa" w:w="1366"/>
+            <w:tcW w:type="dxa" w:w="1065"/>
           </w:tcPr>
           <w:p>
             <w:r>
@@ -831,7 +831,7 @@
         </w:tc>
         <w:tc>
           <w:tcPr>
-            <w:tcW w:type="dxa" w:w="1287"/>
+            <w:tcW w:type="dxa" w:w="1003"/>
           </w:tcPr>
           <w:p>
             <w:r>
@@ -846,7 +846,7 @@
         </w:tc>
         <w:tc>
           <w:tcPr>
-            <w:tcW w:type="dxa" w:w="1100"/>
+            <w:tcW w:type="dxa" w:w="857"/>
           </w:tcPr>
           <w:p>
             <w:r>
@@ -861,7 +861,7 @@
         </w:tc>
         <w:tc>
           <w:tcPr>
-            <w:tcW w:type="dxa" w:w="924"/>
+            <w:tcW w:type="dxa" w:w="721"/>
           </w:tcPr>
           <w:p>
             <w:r>
@@ -876,7 +876,7 @@
         </w:tc>
         <w:tc>
           <w:tcPr>
-            <w:tcW w:type="dxa" w:w="800"/>
+            <w:tcW w:type="dxa" w:w="910"/>
           </w:tcPr>
           <w:p>
             <w:r>
@@ -893,7 +893,7 @@
       <w:tr>
         <w:tc>
           <w:tcPr>
-            <w:tcW w:type="dxa" w:w="800"/>
+            <w:tcW w:type="dxa" w:w="700"/>
           </w:tcPr>
           <w:p>
             <w:r>
@@ -908,7 +908,7 @@
         </w:tc>
         <w:tc>
           <w:tcPr>
-            <w:tcW w:type="dxa" w:w="800"/>
+            <w:tcW w:type="dxa" w:w="700"/>
           </w:tcPr>
           <w:p>
             <w:r>
@@ -923,7 +923,7 @@
         </w:tc>
         <w:tc>
           <w:tcPr>
-            <w:tcW w:type="dxa" w:w="935"/>
+            <w:tcW w:type="dxa" w:w="729"/>
           </w:tcPr>
           <w:p>
             <w:r>
@@ -938,7 +938,7 @@
         </w:tc>
         <w:tc>
           <w:tcPr>
-            <w:tcW w:type="dxa" w:w="1037"/>
+            <w:tcW w:type="dxa" w:w="809"/>
           </w:tcPr>
           <w:p>
             <w:r>
@@ -953,7 +953,7 @@
         </w:tc>
         <w:tc>
           <w:tcPr>
-            <w:tcW w:type="dxa" w:w="1344"/>
+            <w:tcW w:type="dxa" w:w="1048"/>
           </w:tcPr>
           <w:p>
             <w:r>
@@ -968,7 +968,7 @@
         </w:tc>
         <w:tc>
           <w:tcPr>
-            <w:tcW w:type="dxa" w:w="1083"/>
+            <w:tcW w:type="dxa" w:w="844"/>
           </w:tcPr>
           <w:p>
             <w:r>
@@ -983,7 +983,7 @@
         </w:tc>
         <w:tc>
           <w:tcPr>
-            <w:tcW w:type="dxa" w:w="1366"/>
+            <w:tcW w:type="dxa" w:w="1065"/>
           </w:tcPr>
           <w:p>
             <w:r>
@@ -998,7 +998,7 @@
         </w:tc>
         <w:tc>
           <w:tcPr>
-            <w:tcW w:type="dxa" w:w="1287"/>
+            <w:tcW w:type="dxa" w:w="1003"/>
           </w:tcPr>
           <w:p>
             <w:r>
@@ -1013,7 +1013,7 @@
         </w:tc>
         <w:tc>
           <w:tcPr>
-            <w:tcW w:type="dxa" w:w="1100"/>
+            <w:tcW w:type="dxa" w:w="857"/>
           </w:tcPr>
           <w:p>
             <w:r>
@@ -1028,7 +1028,7 @@
         </w:tc>
         <w:tc>
           <w:tcPr>
-            <w:tcW w:type="dxa" w:w="924"/>
+            <w:tcW w:type="dxa" w:w="721"/>
           </w:tcPr>
           <w:p>
             <w:r>
@@ -1043,7 +1043,7 @@
         </w:tc>
         <w:tc>
           <w:tcPr>
-            <w:tcW w:type="dxa" w:w="800"/>
+            <w:tcW w:type="dxa" w:w="910"/>
           </w:tcPr>
           <w:p>
             <w:r>

</xml_diff>